<commit_message>
Converte 3 Reels de setembro em posts estáticos (Plano B) e ajusta outubro
- Setembro (18, 25 e 30/09): Reels viram posts de texto, sem depender de
  gravação. Situações hipotéticas (Joana, Aline) explicitadas no texto, sem
  menção a sessão de terapia (sigilo profissional). CTAs convidando pra
  Comunidade Donas de Si. Post de 30/09 reescrito com ângulo próprio (quem
  tem o padrão evitativo) pra não duplicar o post de ghosting de outubro.
- Novo documento planob-reels-setembro: capa + copy dos 3 posts convertidos,
  pronto pra enviar pra Camila.
- Outubro: adicionado post de 02/10 (codependência emocional, tema novo),
  com CTA de venda pra Comunidade AME-SE.

Co-Authored-By: Claude Sonnet 5 <noreply@anthropic.com>
Claude-Session: https://claude.ai/code/session_01WSt3GY1qD8uPk293jNa2cE
</commit_message>
<xml_diff>
--- a/camila-sartori/calendario-fonte/calendario-instagram-outubro.docx
+++ b/camila-sartori/calendario-fonte/calendario-instagram-outubro.docx
@@ -39,7 +39,7 @@
                 <w:color w:val="FFFFFF"/>
                 <w:sz w:val="23"/>
               </w:rPr>
-              <w:t>SEMANA 1 · 05 a 11/10, Love bombing — Camila ainda viajando, so estatico</w:t>
+              <w:t>SEMANA 1 · 02 a 11/10, Codependência emocional e Love bombing — Camila ainda viajando, so estatico</w:t>
             </w:r>
           </w:p>
         </w:tc>
@@ -48,6 +48,232 @@
     <w:p>
       <w:pPr>
         <w:spacing w:after="80"/>
+      </w:pPr>
+    </w:p>
+    <w:tbl>
+      <w:tblPr>
+        <w:tblW w:type="auto" w:w="0"/>
+        <w:tblLayout w:type="fixed"/>
+        <w:tblLook w:firstColumn="1" w:firstRow="1" w:lastColumn="0" w:lastRow="0" w:noHBand="0" w:noVBand="1" w:val="04A0"/>
+      </w:tblPr>
+      <w:tblGrid>
+        <w:gridCol w:w="10205"/>
+      </w:tblGrid>
+      <w:tr>
+        <w:tc>
+          <w:tcPr>
+            <w:tcW w:type="dxa" w:w="10205"/>
+            <w:shd w:val="clear" w:fill="0A0C0F"/>
+          </w:tcPr>
+          <w:p>
+            <w:r>
+              <w:rPr>
+                <w:b/>
+                <w:i w:val="0"/>
+                <w:color w:val="FFFFFF"/>
+                <w:sz w:val="21"/>
+              </w:rPr>
+              <w:t>📅  02/10 (SEX), Post de texto (sem imagem)</w:t>
+            </w:r>
+          </w:p>
+        </w:tc>
+      </w:tr>
+    </w:tbl>
+    <w:p>
+      <w:pPr>
+        <w:spacing w:after="80"/>
+      </w:pPr>
+    </w:p>
+    <w:tbl>
+      <w:tblPr>
+        <w:tblW w:type="auto" w:w="0"/>
+        <w:tblLayout w:type="fixed"/>
+        <w:tblLook w:firstColumn="1" w:firstRow="1" w:lastColumn="0" w:lastRow="0" w:noHBand="0" w:noVBand="1" w:val="04A0"/>
+      </w:tblPr>
+      <w:tblGrid>
+        <w:gridCol w:w="10205"/>
+      </w:tblGrid>
+      <w:tr>
+        <w:tc>
+          <w:tcPr>
+            <w:tcW w:type="dxa" w:w="10205"/>
+            <w:shd w:val="clear" w:fill="9C1256"/>
+            <w:tcBorders>
+              <w:top w:val="single" w:sz="8" w:space="0" w:color="D9D9D9"/>
+              <w:left w:val="single" w:sz="8" w:space="0" w:color="D9D9D9"/>
+              <w:bottom w:val="single" w:sz="8" w:space="0" w:color="D9D9D9"/>
+              <w:right w:val="single" w:sz="8" w:space="0" w:color="D9D9D9"/>
+            </w:tcBorders>
+          </w:tcPr>
+          <w:p>
+            <w:pPr>
+              <w:spacing w:after="0"/>
+            </w:pPr>
+            <w:r>
+              <w:rPr>
+                <w:b/>
+                <w:i w:val="0"/>
+                <w:color w:val="FFFFFF"/>
+                <w:sz w:val="20"/>
+              </w:rPr>
+              <w:t>⏰ 09h   [ INSTAGRAM ]   💰 VENDA (Automação -&gt; Comunidade AME-SE)</w:t>
+            </w:r>
+          </w:p>
+        </w:tc>
+      </w:tr>
+      <w:tr>
+        <w:tc>
+          <w:tcPr>
+            <w:tcW w:type="dxa" w:w="10205"/>
+            <w:shd w:val="clear" w:fill="FDF6FB"/>
+            <w:tcBorders>
+              <w:top w:val="single" w:sz="8" w:space="0" w:color="D9D9D9"/>
+              <w:left w:val="single" w:sz="8" w:space="0" w:color="D9D9D9"/>
+              <w:bottom w:val="single" w:sz="8" w:space="0" w:color="D9D9D9"/>
+              <w:right w:val="single" w:sz="8" w:space="0" w:color="D9D9D9"/>
+            </w:tcBorders>
+          </w:tcPr>
+          <w:p>
+            <w:pPr>
+              <w:spacing w:after="0"/>
+            </w:pPr>
+          </w:p>
+          <w:p>
+            <w:pPr>
+              <w:spacing w:after="100"/>
+            </w:pPr>
+            <w:r>
+              <w:rPr>
+                <w:b/>
+                <w:i w:val="0"/>
+                <w:sz w:val="18"/>
+              </w:rPr>
+              <w:t xml:space="preserve">Formato: </w:t>
+            </w:r>
+            <w:r>
+              <w:rPr>
+                <w:b w:val="0"/>
+                <w:i w:val="0"/>
+                <w:sz w:val="18"/>
+              </w:rPr>
+              <w:t>Post de texto (sem sugestão de imagem — fundo simples, só texto, paleta da marca)</w:t>
+            </w:r>
+          </w:p>
+          <w:p>
+            <w:pPr>
+              <w:spacing w:after="100"/>
+            </w:pPr>
+            <w:r>
+              <w:rPr>
+                <w:b/>
+                <w:i w:val="0"/>
+                <w:sz w:val="21"/>
+              </w:rPr>
+              <w:t xml:space="preserve">HEADLINE: </w:t>
+            </w:r>
+            <w:r>
+              <w:rPr>
+                <w:b w:val="0"/>
+                <w:i w:val="0"/>
+                <w:sz w:val="21"/>
+              </w:rPr>
+              <w:t>Você já deixou de fazer coisas que gosta, ver quem gosta, ou até de ter opinião própria, só pra manter uma relação em pé?</w:t>
+            </w:r>
+          </w:p>
+          <w:p>
+            <w:pPr>
+              <w:spacing w:after="100"/>
+            </w:pPr>
+            <w:r>
+              <w:rPr>
+                <w:b/>
+                <w:i w:val="0"/>
+                <w:sz w:val="19"/>
+              </w:rPr>
+              <w:t xml:space="preserve">SUBHEADLINE: </w:t>
+            </w:r>
+            <w:r>
+              <w:rPr>
+                <w:b w:val="0"/>
+                <w:i w:val="0"/>
+                <w:sz w:val="19"/>
+              </w:rPr>
+              <w:t>Isso tem nome, e não é amor, é codependência emocional. Leia a legenda.</w:t>
+            </w:r>
+          </w:p>
+          <w:p>
+            <w:pPr>
+              <w:spacing w:after="100"/>
+            </w:pPr>
+            <w:r>
+              <w:rPr>
+                <w:b/>
+                <w:i w:val="0"/>
+                <w:sz w:val="19"/>
+              </w:rPr>
+              <w:t xml:space="preserve">LEGENDA: </w:t>
+            </w:r>
+            <w:r>
+              <w:rPr>
+                <w:b w:val="0"/>
+                <w:i w:val="0"/>
+                <w:sz w:val="19"/>
+              </w:rPr>
+              <w:t>Codependência emocional é quando o bem-estar de alguém passa a depender quase inteiramente da relação, e da aprovação do outro, a ponto da própria identidade ir ficando em segundo plano. Não acontece de um dia pro outro: começa com pequenas cessões, abrir mão de um encontro com amigas, engolir uma opinião, adiar um plano, e vai se acumulando até a pessoa perceber que já não sabe muito bem o que ela mesma queria antes daquela relação. Diferente do amor saudável, onde duas pessoas se apoiam sem deixar de existir sozinhas, a codependência cria uma sensação de que, sem o outro, alguma coisa desmorona, inclusive a própria identidade. Reconhecer esse padrão não é sobre terminar relações, é sobre voltar a se enxergar como alguém inteira, com espaço próprio, mesmo dividindo a vida com outra pessoa. Se você se identificou com isso, te convido a conhecer a Comunidade AME-SE, um espaço com vários cursos e materiais pra você se desenvolver de forma ampla: autoconhecimento, autoestima, relacionamentos familiares, amorosos, com os amigos, no trabalho, além de mentorias em grupo com o pessoal do curso. E o valor é mais barato do que uma pizza, se você optar por parcelar em 12 vezes, fica ainda mais barato que um salgado por mês. Por apenas R$16 por mês, você investe no seu autoconhecimento, na sua autoestima e no seu desenvolvimento pessoal, pra ter mais qualidade de vida e relacionamentos mais saudáveis. Se você se interessou, comente AME-SE que eu te envio todos os detalhes no seu direct, ou, se preferir, acesse a página da comunidade no link da bio, e aproveite também os seus 7 dias grátis.</w:t>
+            </w:r>
+          </w:p>
+          <w:p>
+            <w:pPr>
+              <w:spacing w:after="100"/>
+            </w:pPr>
+            <w:r>
+              <w:rPr>
+                <w:b/>
+                <w:i w:val="0"/>
+                <w:color w:val="666666"/>
+                <w:sz w:val="17"/>
+              </w:rPr>
+              <w:t xml:space="preserve">HASHTAGS: </w:t>
+            </w:r>
+            <w:r>
+              <w:rPr>
+                <w:b w:val="0"/>
+                <w:i w:val="0"/>
+                <w:color w:val="666666"/>
+                <w:sz w:val="17"/>
+              </w:rPr>
+              <w:t>#CodependênciaEmocional #ComunidadeAmeSe #JornadaAmeSe</w:t>
+            </w:r>
+          </w:p>
+          <w:p>
+            <w:pPr>
+              <w:spacing w:after="100"/>
+            </w:pPr>
+            <w:r>
+              <w:rPr>
+                <w:b/>
+                <w:i/>
+                <w:color w:val="9C1256"/>
+                <w:sz w:val="17"/>
+              </w:rPr>
+              <w:t xml:space="preserve">📌  Observação: </w:t>
+            </w:r>
+            <w:r>
+              <w:rPr>
+                <w:b w:val="0"/>
+                <w:i/>
+                <w:color w:val="9C1256"/>
+                <w:sz w:val="17"/>
+              </w:rPr>
+              <w:t>Post de texto, não depende de gravação. Tema novo, ainda não abordado nem em setembro nem em outubro. Assim que postar no Instagram, repostar no grupo do WhatsApp (mesmo texto).</w:t>
+            </w:r>
+          </w:p>
+        </w:tc>
+      </w:tr>
+    </w:tbl>
+    <w:p>
+      <w:pPr>
+        <w:spacing w:after="240"/>
       </w:pPr>
     </w:p>
     <w:tbl>

</xml_diff>